<commit_message>
Add funnel analysis NB
</commit_message>
<xml_diff>
--- a/poc/Data Findings.docx
+++ b/poc/Data Findings.docx
@@ -843,6 +843,576 @@
           <w:rFonts w:ascii="Arial" w:hAnsi="Arial" w:cs="Arial"/>
         </w:rPr>
         <w:t>, is to weight decisions 50% on Markov (true incremental value) and 50% on revenue per lead from last touch (efficiency). That combination gives you both the channel's true importance and its practical efficiency.</w:t>
+      </w:r>
+    </w:p>
+    <w:p>
+      <w:pPr>
+        <w:rPr>
+          <w:rFonts w:ascii="Arial" w:hAnsi="Arial" w:cs="Arial"/>
+        </w:rPr>
+      </w:pPr>
+    </w:p>
+    <w:p>
+      <w:pPr>
+        <w:rPr>
+          <w:rFonts w:ascii="Arial" w:hAnsi="Arial" w:cs="Arial"/>
+          <w:b/>
+          <w:bCs/>
+          <w:color w:val="2E74B5" w:themeColor="accent1" w:themeShade="BF"/>
+          <w:sz w:val="36"/>
+          <w:szCs w:val="36"/>
+        </w:rPr>
+      </w:pPr>
+      <w:r>
+        <w:rPr>
+          <w:rFonts w:ascii="Arial" w:hAnsi="Arial" w:cs="Arial"/>
+          <w:b/>
+          <w:bCs/>
+          <w:color w:val="2E74B5" w:themeColor="accent1" w:themeShade="BF"/>
+          <w:sz w:val="36"/>
+          <w:szCs w:val="36"/>
+        </w:rPr>
+        <w:t xml:space="preserve">Stage </w:t>
+      </w:r>
+      <w:proofErr w:type="gramStart"/>
+      <w:r>
+        <w:rPr>
+          <w:rFonts w:ascii="Arial" w:hAnsi="Arial" w:cs="Arial"/>
+          <w:b/>
+          <w:bCs/>
+          <w:color w:val="2E74B5" w:themeColor="accent1" w:themeShade="BF"/>
+          <w:sz w:val="36"/>
+          <w:szCs w:val="36"/>
+        </w:rPr>
+        <w:t>3:-</w:t>
+      </w:r>
+      <w:proofErr w:type="gramEnd"/>
+    </w:p>
+    <w:p>
+      <w:pPr>
+        <w:rPr>
+          <w:rFonts w:ascii="Arial" w:hAnsi="Arial" w:cs="Arial"/>
+        </w:rPr>
+      </w:pPr>
+      <w:r>
+        <w:rPr>
+          <w:rFonts w:ascii="Arial" w:hAnsi="Arial" w:cs="Arial"/>
+          <w:b/>
+          <w:bCs/>
+        </w:rPr>
+        <w:t>The Volume Funnel — what the drop-off numbers mean</w:t>
+      </w:r>
+    </w:p>
+    <w:p>
+      <w:pPr>
+        <w:rPr>
+          <w:rFonts w:ascii="Arial" w:hAnsi="Arial" w:cs="Arial"/>
+        </w:rPr>
+      </w:pPr>
+      <w:r>
+        <w:rPr>
+          <w:rFonts w:ascii="Arial" w:hAnsi="Arial" w:cs="Arial"/>
+        </w:rPr>
+        <w:t xml:space="preserve">Starting with 8,000 leads, only 252 </w:t>
+      </w:r>
+      <w:proofErr w:type="gramStart"/>
+      <w:r>
+        <w:rPr>
+          <w:rFonts w:ascii="Arial" w:hAnsi="Arial" w:cs="Arial"/>
+        </w:rPr>
+        <w:t>end</w:t>
+      </w:r>
+      <w:proofErr w:type="gramEnd"/>
+      <w:r>
+        <w:rPr>
+          <w:rFonts w:ascii="Arial" w:hAnsi="Arial" w:cs="Arial"/>
+        </w:rPr>
+        <w:t xml:space="preserve"> up as repeat sellers. That means 96.85% of everyone who ever showed interest never became a reliable revenue source. Each drop-off stage tells a different story about where the problem is.</w:t>
+      </w:r>
+    </w:p>
+    <w:p>
+      <w:pPr>
+        <w:rPr>
+          <w:rFonts w:ascii="Arial" w:hAnsi="Arial" w:cs="Arial"/>
+        </w:rPr>
+      </w:pPr>
+      <w:r>
+        <w:rPr>
+          <w:rFonts w:ascii="Arial" w:hAnsi="Arial" w:cs="Arial"/>
+        </w:rPr>
+        <w:t>The biggest drop in absolute numbers is right at the top — 4,942 leads have no contact date recorded. This is a data tracking failure, not a sales failure. These leads came in through channels that weren't properly tagged, so the sales team either never saw them or couldn't reach them. In a real startup this would be the first thing you'd fix — better UTM tracking and CRM hygiene.</w:t>
+      </w:r>
+    </w:p>
+    <w:p>
+      <w:pPr>
+        <w:rPr>
+          <w:rFonts w:ascii="Arial" w:hAnsi="Arial" w:cs="Arial"/>
+        </w:rPr>
+      </w:pPr>
+      <w:r>
+        <w:rPr>
+          <w:rFonts w:ascii="Arial" w:hAnsi="Arial" w:cs="Arial"/>
+        </w:rPr>
+        <w:t xml:space="preserve">The second biggest drop is from leads with a contact date (3,058) down to closed deals (842) — a 72.5% drop-off. This is the core sales efficiency problem. Out of every 10 leads the sales team </w:t>
+      </w:r>
+      <w:proofErr w:type="gramStart"/>
+      <w:r>
+        <w:rPr>
+          <w:rFonts w:ascii="Arial" w:hAnsi="Arial" w:cs="Arial"/>
+        </w:rPr>
+        <w:t>actually spoke</w:t>
+      </w:r>
+      <w:proofErr w:type="gramEnd"/>
+      <w:r>
+        <w:rPr>
+          <w:rFonts w:ascii="Arial" w:hAnsi="Arial" w:cs="Arial"/>
+        </w:rPr>
+        <w:t xml:space="preserve"> to, only 2.7 converted. That's a sales process and lead quality problem combined.</w:t>
+      </w:r>
+    </w:p>
+    <w:p>
+      <w:pPr>
+        <w:rPr>
+          <w:rFonts w:ascii="Arial" w:hAnsi="Arial" w:cs="Arial"/>
+        </w:rPr>
+      </w:pPr>
+      <w:r>
+        <w:rPr>
+          <w:rFonts w:ascii="Arial" w:hAnsi="Arial" w:cs="Arial"/>
+        </w:rPr>
+        <w:t xml:space="preserve">The most important insight is the activation gap — 54.9% of sellers who signed a deal never placed a single order. They converted on paper but never activated on the platform. This means </w:t>
+      </w:r>
+      <w:proofErr w:type="spellStart"/>
+      <w:r>
+        <w:rPr>
+          <w:rFonts w:ascii="Arial" w:hAnsi="Arial" w:cs="Arial"/>
+        </w:rPr>
+        <w:t>Olist's</w:t>
+      </w:r>
+      <w:proofErr w:type="spellEnd"/>
+      <w:r>
+        <w:rPr>
+          <w:rFonts w:ascii="Arial" w:hAnsi="Arial" w:cs="Arial"/>
+        </w:rPr>
+        <w:t xml:space="preserve"> real growth lever isn't getting more leads, it's getting signed sellers to </w:t>
+      </w:r>
+      <w:proofErr w:type="gramStart"/>
+      <w:r>
+        <w:rPr>
+          <w:rFonts w:ascii="Arial" w:hAnsi="Arial" w:cs="Arial"/>
+        </w:rPr>
+        <w:t>actually start</w:t>
+      </w:r>
+      <w:proofErr w:type="gramEnd"/>
+      <w:r>
+        <w:rPr>
+          <w:rFonts w:ascii="Arial" w:hAnsi="Arial" w:cs="Arial"/>
+        </w:rPr>
+        <w:t xml:space="preserve"> selling. An onboarding improvement here would have more impact than doubling the marketing budget.</w:t>
+      </w:r>
+    </w:p>
+    <w:p>
+      <w:pPr>
+        <w:rPr>
+          <w:rFonts w:ascii="Arial" w:hAnsi="Arial" w:cs="Arial"/>
+        </w:rPr>
+      </w:pPr>
+    </w:p>
+    <w:p>
+      <w:pPr>
+        <w:rPr>
+          <w:rFonts w:ascii="Arial" w:hAnsi="Arial" w:cs="Arial"/>
+        </w:rPr>
+      </w:pPr>
+    </w:p>
+    <w:p>
+      <w:pPr>
+        <w:rPr>
+          <w:rFonts w:ascii="Arial" w:hAnsi="Arial" w:cs="Arial"/>
+        </w:rPr>
+      </w:pPr>
+    </w:p>
+    <w:p>
+      <w:pPr>
+        <w:rPr>
+          <w:rFonts w:ascii="Arial" w:hAnsi="Arial" w:cs="Arial"/>
+        </w:rPr>
+      </w:pPr>
+      <w:r>
+        <w:rPr>
+          <w:rFonts w:ascii="Arial" w:hAnsi="Arial" w:cs="Arial"/>
+        </w:rPr>
+        <w:lastRenderedPageBreak/>
+        <w:pict w14:anchorId="06641E8A">
+          <v:rect id="_x0000_i1077" style="width:0;height:1.5pt" o:hralign="center" o:hrstd="t" o:hr="t" fillcolor="#a0a0a0" stroked="f"/>
+        </w:pict>
+      </w:r>
+    </w:p>
+    <w:p>
+      <w:pPr>
+        <w:rPr>
+          <w:rFonts w:ascii="Arial" w:hAnsi="Arial" w:cs="Arial"/>
+          <w:color w:val="2E74B5" w:themeColor="accent1" w:themeShade="BF"/>
+        </w:rPr>
+      </w:pPr>
+      <w:r>
+        <w:rPr>
+          <w:rFonts w:ascii="Arial" w:hAnsi="Arial" w:cs="Arial"/>
+          <w:b/>
+          <w:bCs/>
+          <w:color w:val="2E74B5" w:themeColor="accent1" w:themeShade="BF"/>
+        </w:rPr>
+        <w:t>The Channel Funnel — the three numbers that matter per channel</w:t>
+      </w:r>
+    </w:p>
+    <w:p>
+      <w:pPr>
+        <w:rPr>
+          <w:rFonts w:ascii="Arial" w:hAnsi="Arial" w:cs="Arial"/>
+        </w:rPr>
+      </w:pPr>
+      <w:r>
+        <w:rPr>
+          <w:rFonts w:ascii="Arial" w:hAnsi="Arial" w:cs="Arial"/>
+        </w:rPr>
+        <w:t>CVR alone is not enough to judge a channel. You need to look at CVR, activation rate, and revenue per lead together.</w:t>
+      </w:r>
+    </w:p>
+    <w:p>
+      <w:pPr>
+        <w:rPr>
+          <w:rFonts w:ascii="Arial" w:hAnsi="Arial" w:cs="Arial"/>
+        </w:rPr>
+      </w:pPr>
+      <w:r>
+        <w:rPr>
+          <w:rFonts w:ascii="Arial" w:hAnsi="Arial" w:cs="Arial"/>
+        </w:rPr>
+        <w:t>unknown has the highest CVR at 16.7% but only 44% activation rate — the lowest of any meaningful channel. These leads convert easily but then go quiet. High intent to sign, low intent to sell.</w:t>
+      </w:r>
+    </w:p>
+    <w:p>
+      <w:pPr>
+        <w:rPr>
+          <w:rFonts w:ascii="Arial" w:hAnsi="Arial" w:cs="Arial"/>
+        </w:rPr>
+      </w:pPr>
+      <w:proofErr w:type="spellStart"/>
+      <w:r>
+        <w:rPr>
+          <w:rFonts w:ascii="Arial" w:hAnsi="Arial" w:cs="Arial"/>
+        </w:rPr>
+        <w:t>paid_search</w:t>
+      </w:r>
+      <w:proofErr w:type="spellEnd"/>
+      <w:r>
+        <w:rPr>
+          <w:rFonts w:ascii="Arial" w:hAnsi="Arial" w:cs="Arial"/>
+        </w:rPr>
+        <w:t xml:space="preserve"> is the most balanced channel across all three metrics — 12.3% CVR, 52% activation rate (highest of all channels), 62% repeat rate, and $97.90 revenue per lead. This is your best performing channel end-to-end when you look at the full journey not just conversion.</w:t>
+      </w:r>
+    </w:p>
+    <w:p>
+      <w:pPr>
+        <w:rPr>
+          <w:rFonts w:ascii="Arial" w:hAnsi="Arial" w:cs="Arial"/>
+        </w:rPr>
+      </w:pPr>
+      <w:proofErr w:type="spellStart"/>
+      <w:r>
+        <w:rPr>
+          <w:rFonts w:ascii="Arial" w:hAnsi="Arial" w:cs="Arial"/>
+        </w:rPr>
+        <w:t>organic_search</w:t>
+      </w:r>
+      <w:proofErr w:type="spellEnd"/>
+      <w:r>
+        <w:rPr>
+          <w:rFonts w:ascii="Arial" w:hAnsi="Arial" w:cs="Arial"/>
+        </w:rPr>
+        <w:t xml:space="preserve"> has the highest absolute </w:t>
+      </w:r>
+      <w:proofErr w:type="gramStart"/>
+      <w:r>
+        <w:rPr>
+          <w:rFonts w:ascii="Arial" w:hAnsi="Arial" w:cs="Arial"/>
+        </w:rPr>
+        <w:t>numbers</w:t>
+      </w:r>
+      <w:proofErr w:type="gramEnd"/>
+      <w:r>
+        <w:rPr>
+          <w:rFonts w:ascii="Arial" w:hAnsi="Arial" w:cs="Arial"/>
+        </w:rPr>
+        <w:t xml:space="preserve"> but 42% activation rate drags it below paid search on true efficiency. Organic brings in volume but paid search brings in better quality sellers.</w:t>
+      </w:r>
+    </w:p>
+    <w:p>
+      <w:pPr>
+        <w:rPr>
+          <w:rFonts w:ascii="Arial" w:hAnsi="Arial" w:cs="Arial"/>
+        </w:rPr>
+      </w:pPr>
+      <w:proofErr w:type="spellStart"/>
+      <w:r>
+        <w:rPr>
+          <w:rFonts w:ascii="Arial" w:hAnsi="Arial" w:cs="Arial"/>
+        </w:rPr>
+        <w:t>direct_traffic</w:t>
+      </w:r>
+      <w:proofErr w:type="spellEnd"/>
+      <w:r>
+        <w:rPr>
+          <w:rFonts w:ascii="Arial" w:hAnsi="Arial" w:cs="Arial"/>
+        </w:rPr>
+        <w:t xml:space="preserve"> has a 71% repeat rate — the highest of any channel. Sellers who come directly to the site and sign up are the most loyal and most active long-term. This channel is severely underinvested based on its $43.90 revenue per lead surface number, but its repeat rate tells a much better story.</w:t>
+      </w:r>
+    </w:p>
+    <w:p>
+      <w:pPr>
+        <w:rPr>
+          <w:rFonts w:ascii="Arial" w:hAnsi="Arial" w:cs="Arial"/>
+        </w:rPr>
+      </w:pPr>
+      <w:r>
+        <w:rPr>
+          <w:rFonts w:ascii="Arial" w:hAnsi="Arial" w:cs="Arial"/>
+        </w:rPr>
+        <w:t>email is the weakest end-to-end — 3% CVR, 40% activation, 50% repeat. High effort, low return at every stage.</w:t>
+      </w:r>
+    </w:p>
+    <w:p>
+      <w:pPr>
+        <w:rPr>
+          <w:rFonts w:ascii="Arial" w:hAnsi="Arial" w:cs="Arial"/>
+        </w:rPr>
+      </w:pPr>
+      <w:r>
+        <w:rPr>
+          <w:rFonts w:ascii="Arial" w:hAnsi="Arial" w:cs="Arial"/>
+        </w:rPr>
+        <w:t>social brings 1,350 leads but only 31 ever placed an order. That's a 2.3% activation rate when measured against total leads generated. Social is generating awareness but not quality intent.</w:t>
+      </w:r>
+    </w:p>
+    <w:p>
+      <w:pPr>
+        <w:rPr>
+          <w:rFonts w:ascii="Arial" w:hAnsi="Arial" w:cs="Arial"/>
+        </w:rPr>
+      </w:pPr>
+      <w:r>
+        <w:rPr>
+          <w:rFonts w:ascii="Arial" w:hAnsi="Arial" w:cs="Arial"/>
+        </w:rPr>
+        <w:pict w14:anchorId="49F44D14">
+          <v:rect id="_x0000_i1078" style="width:0;height:1.5pt" o:hralign="center" o:hrstd="t" o:hr="t" fillcolor="#a0a0a0" stroked="f"/>
+        </w:pict>
+      </w:r>
+    </w:p>
+    <w:p>
+      <w:pPr>
+        <w:rPr>
+          <w:rFonts w:ascii="Arial" w:hAnsi="Arial" w:cs="Arial"/>
+          <w:color w:val="2E74B5" w:themeColor="accent1" w:themeShade="BF"/>
+        </w:rPr>
+      </w:pPr>
+      <w:r>
+        <w:rPr>
+          <w:rFonts w:ascii="Arial" w:hAnsi="Arial" w:cs="Arial"/>
+          <w:b/>
+          <w:bCs/>
+          <w:color w:val="2E74B5" w:themeColor="accent1" w:themeShade="BF"/>
+        </w:rPr>
+        <w:t>The Cohort Analysis — the growth inflection point</w:t>
+      </w:r>
+    </w:p>
+    <w:p>
+      <w:pPr>
+        <w:rPr>
+          <w:rFonts w:ascii="Arial" w:hAnsi="Arial" w:cs="Arial"/>
+        </w:rPr>
+      </w:pPr>
+      <w:r>
+        <w:rPr>
+          <w:rFonts w:ascii="Arial" w:hAnsi="Arial" w:cs="Arial"/>
+        </w:rPr>
+        <w:t>This is one of the most interesting findings in the entire project. Look at the CVR trend over time:</w:t>
+      </w:r>
+    </w:p>
+    <w:p>
+      <w:pPr>
+        <w:rPr>
+          <w:rFonts w:ascii="Arial" w:hAnsi="Arial" w:cs="Arial"/>
+        </w:rPr>
+      </w:pPr>
+      <w:r>
+        <w:rPr>
+          <w:rFonts w:ascii="Arial" w:hAnsi="Arial" w:cs="Arial"/>
+        </w:rPr>
+        <w:t>2017 cohorts (Jan–Dec) are consistently weak — conversion rates ranging from 0% to 5.1%. The product-market fit wasn't there yet, the sales process wasn't refined, and the platform was still early.</w:t>
+      </w:r>
+    </w:p>
+    <w:p>
+      <w:pPr>
+        <w:rPr>
+          <w:rFonts w:ascii="Arial" w:hAnsi="Arial" w:cs="Arial"/>
+        </w:rPr>
+      </w:pPr>
+      <w:r>
+        <w:rPr>
+          <w:rFonts w:ascii="Arial" w:hAnsi="Arial" w:cs="Arial"/>
+        </w:rPr>
+        <w:t xml:space="preserve">Then January 2018 hits at 7.9% and something changes dramatically. February 2018 jumps to 12.7%, March to 15.6%, April to 16.5%. The conversion rate more than triples in the space of three months. This is a genuine inflection point — either </w:t>
+      </w:r>
+      <w:proofErr w:type="spellStart"/>
+      <w:r>
+        <w:rPr>
+          <w:rFonts w:ascii="Arial" w:hAnsi="Arial" w:cs="Arial"/>
+        </w:rPr>
+        <w:t>Olist</w:t>
+      </w:r>
+      <w:proofErr w:type="spellEnd"/>
+      <w:r>
+        <w:rPr>
+          <w:rFonts w:ascii="Arial" w:hAnsi="Arial" w:cs="Arial"/>
+        </w:rPr>
+        <w:t xml:space="preserve"> improved their sales process, refined their targeting, started attracting better quality leads, or some combination of all three.</w:t>
+      </w:r>
+    </w:p>
+    <w:p>
+      <w:pPr>
+        <w:rPr>
+          <w:rFonts w:ascii="Arial" w:hAnsi="Arial" w:cs="Arial"/>
+        </w:rPr>
+      </w:pPr>
+      <w:r>
+        <w:rPr>
+          <w:rFonts w:ascii="Arial" w:hAnsi="Arial" w:cs="Arial"/>
+        </w:rPr>
+        <w:t>From February 2018 onwards the floor CVR never drops below 11.7% and peaks at 18.2% in December 2018. The platform had clearly found its rhythm by early 2018.</w:t>
+      </w:r>
+    </w:p>
+    <w:p>
+      <w:pPr>
+        <w:rPr>
+          <w:rFonts w:ascii="Arial" w:hAnsi="Arial" w:cs="Arial"/>
+        </w:rPr>
+      </w:pPr>
+      <w:r>
+        <w:rPr>
+          <w:rFonts w:ascii="Arial" w:hAnsi="Arial" w:cs="Arial"/>
+        </w:rPr>
+        <w:t xml:space="preserve">The revenue per lead tells the same story even more dramatically. Early 2017 cohorts generate near-zero revenue per lead. March 2018 spikes to $233.83 — the single best month in the dataset. This isn't just more conversions, it's </w:t>
+      </w:r>
+      <w:proofErr w:type="gramStart"/>
+      <w:r>
+        <w:rPr>
+          <w:rFonts w:ascii="Arial" w:hAnsi="Arial" w:cs="Arial"/>
+        </w:rPr>
+        <w:t>better quality</w:t>
+      </w:r>
+      <w:proofErr w:type="gramEnd"/>
+      <w:r>
+        <w:rPr>
+          <w:rFonts w:ascii="Arial" w:hAnsi="Arial" w:cs="Arial"/>
+        </w:rPr>
+        <w:t xml:space="preserve"> sellers joining in that period.</w:t>
+      </w:r>
+    </w:p>
+    <w:p>
+      <w:pPr>
+        <w:rPr>
+          <w:rFonts w:ascii="Arial" w:hAnsi="Arial" w:cs="Arial"/>
+        </w:rPr>
+      </w:pPr>
+      <w:r>
+        <w:rPr>
+          <w:rFonts w:ascii="Arial" w:hAnsi="Arial" w:cs="Arial"/>
+        </w:rPr>
+        <w:lastRenderedPageBreak/>
+        <w:t>The practical implication: if you were advising a growth team, you would focus analysis and benchmarks on 2018 data only, because 2017 represents a fundamentally different stage of the business. Mixing the two periods when calculating averages distorts every metric.</w:t>
+      </w:r>
+    </w:p>
+    <w:p>
+      <w:pPr>
+        <w:rPr>
+          <w:rFonts w:ascii="Arial" w:hAnsi="Arial" w:cs="Arial"/>
+        </w:rPr>
+      </w:pPr>
+      <w:r>
+        <w:rPr>
+          <w:rFonts w:ascii="Arial" w:hAnsi="Arial" w:cs="Arial"/>
+        </w:rPr>
+        <w:pict w14:anchorId="3C3DD3E7">
+          <v:rect id="_x0000_i1079" style="width:0;height:1.5pt" o:hralign="center" o:hrstd="t" o:hr="t" fillcolor="#a0a0a0" stroked="f"/>
+        </w:pict>
+      </w:r>
+    </w:p>
+    <w:p>
+      <w:pPr>
+        <w:rPr>
+          <w:rFonts w:ascii="Arial" w:hAnsi="Arial" w:cs="Arial"/>
+        </w:rPr>
+      </w:pPr>
+      <w:r>
+        <w:rPr>
+          <w:rFonts w:ascii="Arial" w:hAnsi="Arial" w:cs="Arial"/>
+          <w:b/>
+          <w:bCs/>
+        </w:rPr>
+        <w:t>What this means going into Stage 4</w:t>
+      </w:r>
+    </w:p>
+    <w:p>
+      <w:pPr>
+        <w:rPr>
+          <w:rFonts w:ascii="Arial" w:hAnsi="Arial" w:cs="Arial"/>
+        </w:rPr>
+      </w:pPr>
+      <w:r>
+        <w:rPr>
+          <w:rFonts w:ascii="Arial" w:hAnsi="Arial" w:cs="Arial"/>
+        </w:rPr>
+        <w:t>We now know three things that will shape the CAC/LTV analysis:</w:t>
+      </w:r>
+    </w:p>
+    <w:p>
+      <w:pPr>
+        <w:rPr>
+          <w:rFonts w:ascii="Arial" w:hAnsi="Arial" w:cs="Arial"/>
+        </w:rPr>
+      </w:pPr>
+      <w:r>
+        <w:rPr>
+          <w:rFonts w:ascii="Arial" w:hAnsi="Arial" w:cs="Arial"/>
+        </w:rPr>
+        <w:t>The 380 active sellers are the only ones generating revenue so CAC/LTV should be calculated against this group, not all 842 conversions.</w:t>
+      </w:r>
+    </w:p>
+    <w:p>
+      <w:pPr>
+        <w:rPr>
+          <w:rFonts w:ascii="Arial" w:hAnsi="Arial" w:cs="Arial"/>
+        </w:rPr>
+      </w:pPr>
+      <w:r>
+        <w:rPr>
+          <w:rFonts w:ascii="Arial" w:hAnsi="Arial" w:cs="Arial"/>
+        </w:rPr>
+        <w:t>Paid search and direct traffic are the channels worth investing in based on full-funnel efficiency, not just top-of-funnel CVR.</w:t>
+      </w:r>
+    </w:p>
+    <w:p>
+      <w:pPr>
+        <w:rPr>
+          <w:rFonts w:ascii="Arial" w:hAnsi="Arial" w:cs="Arial"/>
+        </w:rPr>
+      </w:pPr>
+      <w:r>
+        <w:rPr>
+          <w:rFonts w:ascii="Arial" w:hAnsi="Arial" w:cs="Arial"/>
+        </w:rPr>
+        <w:t>The 2018 cohorts are where the real unit economics live — 2017 data will drag down averages and should be segmented out.</w:t>
       </w:r>
     </w:p>
     <w:p>

</xml_diff>